<commit_message>
Enhance submission management by adding application ID to submissions, implementing department assignments for faculty roles, and updating middleware for improved role handling. Update .gitignore to exclude local uploads and refine overview card components for better status representation.
</commit_message>
<xml_diff>
--- a/public/fwdstudentsfinalforms/Faculty-Staff Research Publication Form (Other All Faculties) .docx
+++ b/public/fwdstudentsfinalforms/Faculty-Staff Research Publication Form (Other All Faculties) .docx
@@ -356,11 +356,7 @@
           <w:tcPr>
             <w:tcW w:w="5309" w:type="dxa"/>
           </w:tcPr>
-          <w:p>
-            <w:r>
-              <w:t xml:space="preserve">Auto fetch from SAP database </w:t>
-            </w:r>
-          </w:p>
+          <w:p/>
         </w:tc>
       </w:tr>
       <w:tr>
@@ -443,11 +439,7 @@
           <w:tcPr>
             <w:tcW w:w="5309" w:type="dxa"/>
           </w:tcPr>
-          <w:p>
-            <w:r>
-              <w:t xml:space="preserve">Auto fetch from SAP database </w:t>
-            </w:r>
-          </w:p>
+          <w:p/>
         </w:tc>
       </w:tr>
       <w:tr>
@@ -472,11 +464,7 @@
           <w:tcPr>
             <w:tcW w:w="5309" w:type="dxa"/>
           </w:tcPr>
-          <w:p>
-            <w:r>
-              <w:t xml:space="preserve">Auto fetch from SAP database </w:t>
-            </w:r>
-          </w:p>
+          <w:p/>
         </w:tc>
       </w:tr>
       <w:tr>
@@ -501,11 +489,7 @@
           <w:tcPr>
             <w:tcW w:w="5309" w:type="dxa"/>
           </w:tcPr>
-          <w:p>
-            <w:r>
-              <w:t xml:space="preserve">Auto fetch from SAP database </w:t>
-            </w:r>
-          </w:p>
+          <w:p/>
         </w:tc>
       </w:tr>
     </w:tbl>
@@ -851,11 +835,7 @@
           <w:tcPr>
             <w:tcW w:w="5309" w:type="dxa"/>
           </w:tcPr>
-          <w:p>
-            <w:r>
-              <w:t xml:space="preserve">Auto fetch from SAP database </w:t>
-            </w:r>
-          </w:p>
+          <w:p/>
         </w:tc>
       </w:tr>
       <w:tr>
@@ -938,11 +918,7 @@
           <w:tcPr>
             <w:tcW w:w="5309" w:type="dxa"/>
           </w:tcPr>
-          <w:p>
-            <w:r>
-              <w:t xml:space="preserve">Auto fetch from SAP database </w:t>
-            </w:r>
-          </w:p>
+          <w:p/>
         </w:tc>
       </w:tr>
       <w:tr>
@@ -967,11 +943,7 @@
           <w:tcPr>
             <w:tcW w:w="5309" w:type="dxa"/>
           </w:tcPr>
-          <w:p>
-            <w:r>
-              <w:t xml:space="preserve">Auto fetch from SAP database </w:t>
-            </w:r>
-          </w:p>
+          <w:p/>
         </w:tc>
       </w:tr>
       <w:tr>
@@ -996,11 +968,7 @@
           <w:tcPr>
             <w:tcW w:w="5309" w:type="dxa"/>
           </w:tcPr>
-          <w:p>
-            <w:r>
-              <w:t xml:space="preserve">Auto fetch from SAP database </w:t>
-            </w:r>
-          </w:p>
+          <w:p/>
         </w:tc>
       </w:tr>
     </w:tbl>
@@ -1293,11 +1261,7 @@
           <w:tcPr>
             <w:tcW w:w="5309" w:type="dxa"/>
           </w:tcPr>
-          <w:p>
-            <w:r>
-              <w:t xml:space="preserve">Auto fetch from SAP database </w:t>
-            </w:r>
-          </w:p>
+          <w:p/>
         </w:tc>
       </w:tr>
       <w:tr>
@@ -1366,11 +1330,7 @@
           <w:tcPr>
             <w:tcW w:w="5309" w:type="dxa"/>
           </w:tcPr>
-          <w:p>
-            <w:r>
-              <w:t xml:space="preserve">Auto fetch from SAP database </w:t>
-            </w:r>
-          </w:p>
+          <w:p/>
         </w:tc>
       </w:tr>
       <w:tr>
@@ -1395,11 +1355,7 @@
           <w:tcPr>
             <w:tcW w:w="5309" w:type="dxa"/>
           </w:tcPr>
-          <w:p>
-            <w:r>
-              <w:t xml:space="preserve">Auto fetch from SAP database </w:t>
-            </w:r>
-          </w:p>
+          <w:p/>
         </w:tc>
       </w:tr>
       <w:tr>
@@ -1424,11 +1380,7 @@
           <w:tcPr>
             <w:tcW w:w="5309" w:type="dxa"/>
           </w:tcPr>
-          <w:p>
-            <w:r>
-              <w:t xml:space="preserve">Auto fetch from SAP database </w:t>
-            </w:r>
-          </w:p>
+          <w:p/>
         </w:tc>
       </w:tr>
     </w:tbl>

</xml_diff>